<commit_message>
EHIS-2356 EHIS-890_Sprint 9_QA_ Issues in Water Bacteriology Requisition document (based on discussion on 7/30 with functional team)
</commit_message>
<xml_diff>
--- a/PHOCS-Docgentemplates/PHOCS Water Bacteriology Requisition Template_V0.1.docx
+++ b/PHOCS-Docgentemplates/PHOCS Water Bacteriology Requisition Template_V0.1.docx
@@ -54,10 +54,19 @@
             </w:pPr>
             <w:r>
               <w:rPr>
-                <w:sz w:val="18"/>
-                <w:szCs w:val="18"/>
-              </w:rPr>
-              <w:t xml:space="preserve">Lab Number: </w:t>
+                <w:b/>
+                <w:bCs/>
+                <w:sz w:val="18"/>
+                <w:szCs w:val="18"/>
+              </w:rPr>
+              <w:t>Lab Number:</w:t>
+            </w:r>
+            <w:r>
+              <w:rPr>
+                <w:sz w:val="18"/>
+                <w:szCs w:val="18"/>
+              </w:rPr>
+              <w:t xml:space="preserve"> </w:t>
             </w:r>
             <w:r>
               <w:rPr>
@@ -68,9 +77,8 @@
             </w:r>
             <w:r>
               <w:rPr>
-                <w:color w:val="FF0000"/>
-                <w:sz w:val="18"/>
-                <w:szCs w:val="18"/>
+                <w:sz w:val="20"/>
+                <w:szCs w:val="20"/>
                 <w:lang w:val="en-CA"/>
               </w:rPr>
               <w:t>{{</w:t>
@@ -78,18 +86,17 @@
             <w:proofErr w:type="spellStart"/>
             <w:r>
               <w:rPr>
-                <w:color w:val="FF0000"/>
-                <w:sz w:val="18"/>
-                <w:szCs w:val="18"/>
+                <w:sz w:val="20"/>
+                <w:szCs w:val="20"/>
+                <w:lang w:val="en-CA"/>
               </w:rPr>
               <w:t>PHSALabNumber</w:t>
             </w:r>
             <w:proofErr w:type="spellEnd"/>
             <w:r>
               <w:rPr>
-                <w:color w:val="FF0000"/>
-                <w:sz w:val="18"/>
-                <w:szCs w:val="18"/>
+                <w:sz w:val="20"/>
+                <w:szCs w:val="20"/>
                 <w:lang w:val="en-CA"/>
               </w:rPr>
               <w:t>}}</w:t>
@@ -119,10 +126,19 @@
             </w:pPr>
             <w:r>
               <w:rPr>
-                <w:sz w:val="18"/>
-                <w:szCs w:val="18"/>
-              </w:rPr>
-              <w:t xml:space="preserve">Reported on: </w:t>
+                <w:b/>
+                <w:bCs/>
+                <w:sz w:val="18"/>
+                <w:szCs w:val="18"/>
+              </w:rPr>
+              <w:t>Reported on:</w:t>
+            </w:r>
+            <w:r>
+              <w:rPr>
+                <w:sz w:val="18"/>
+                <w:szCs w:val="18"/>
+              </w:rPr>
+              <w:t xml:space="preserve"> </w:t>
             </w:r>
             <w:r>
               <w:rPr>
@@ -133,27 +149,27 @@
             </w:r>
             <w:r>
               <w:rPr>
-                <w:color w:val="FF0000"/>
-                <w:sz w:val="18"/>
-                <w:szCs w:val="18"/>
+                <w:sz w:val="20"/>
+                <w:szCs w:val="20"/>
+                <w:lang w:val="en-CA"/>
               </w:rPr>
               <w:t>{{</w:t>
             </w:r>
             <w:proofErr w:type="spellStart"/>
             <w:r>
               <w:rPr>
-                <w:color w:val="FF0000"/>
-                <w:sz w:val="18"/>
-                <w:szCs w:val="18"/>
+                <w:sz w:val="20"/>
+                <w:szCs w:val="20"/>
+                <w:lang w:val="en-CA"/>
               </w:rPr>
               <w:t>ReportedOn</w:t>
             </w:r>
             <w:proofErr w:type="spellEnd"/>
             <w:r>
               <w:rPr>
-                <w:color w:val="FF0000"/>
-                <w:sz w:val="18"/>
-                <w:szCs w:val="18"/>
+                <w:sz w:val="20"/>
+                <w:szCs w:val="20"/>
+                <w:lang w:val="en-CA"/>
               </w:rPr>
               <w:t>}}</w:t>
             </w:r>
@@ -299,6 +315,8 @@
             </w:pPr>
             <w:r>
               <w:rPr>
+                <w:b/>
+                <w:bCs/>
                 <w:sz w:val="18"/>
                 <w:szCs w:val="18"/>
               </w:rPr>
@@ -306,6 +324,8 @@
             </w:r>
             <w:r>
               <w:rPr>
+                <w:b/>
+                <w:bCs/>
                 <w:sz w:val="18"/>
                 <w:szCs w:val="18"/>
               </w:rPr>
@@ -320,9 +340,8 @@
             </w:r>
             <w:r>
               <w:rPr>
-                <w:color w:val="FF0000"/>
-                <w:sz w:val="18"/>
-                <w:szCs w:val="18"/>
+                <w:sz w:val="20"/>
+                <w:szCs w:val="20"/>
                 <w:lang w:val="en-CA"/>
               </w:rPr>
               <w:t>{{</w:t>
@@ -330,9 +349,8 @@
             <w:proofErr w:type="spellStart"/>
             <w:r>
               <w:rPr>
-                <w:color w:val="FF0000"/>
-                <w:sz w:val="18"/>
-                <w:szCs w:val="18"/>
+                <w:sz w:val="20"/>
+                <w:szCs w:val="20"/>
                 <w:lang w:val="en-CA"/>
               </w:rPr>
               <w:t>MHOName</w:t>
@@ -340,9 +358,8 @@
             <w:proofErr w:type="spellEnd"/>
             <w:r>
               <w:rPr>
-                <w:color w:val="FF0000"/>
-                <w:sz w:val="18"/>
-                <w:szCs w:val="18"/>
+                <w:sz w:val="20"/>
+                <w:szCs w:val="20"/>
                 <w:lang w:val="en-CA"/>
               </w:rPr>
               <w:t>}}</w:t>
@@ -380,10 +397,19 @@
             </w:pPr>
             <w:r>
               <w:rPr>
-                <w:sz w:val="18"/>
-                <w:szCs w:val="18"/>
-              </w:rPr>
-              <w:t xml:space="preserve">Name: </w:t>
+                <w:b/>
+                <w:bCs/>
+                <w:sz w:val="18"/>
+                <w:szCs w:val="18"/>
+              </w:rPr>
+              <w:t>Name:</w:t>
+            </w:r>
+            <w:r>
+              <w:rPr>
+                <w:sz w:val="18"/>
+                <w:szCs w:val="18"/>
+              </w:rPr>
+              <w:t xml:space="preserve"> </w:t>
             </w:r>
             <w:r>
               <w:rPr>
@@ -394,27 +420,27 @@
             </w:r>
             <w:r>
               <w:rPr>
-                <w:color w:val="FF0000"/>
-                <w:sz w:val="18"/>
-                <w:szCs w:val="18"/>
+                <w:sz w:val="20"/>
+                <w:szCs w:val="20"/>
+                <w:lang w:val="en-CA"/>
               </w:rPr>
               <w:t>{{</w:t>
             </w:r>
             <w:proofErr w:type="spellStart"/>
             <w:r>
               <w:rPr>
-                <w:color w:val="FF0000"/>
-                <w:sz w:val="18"/>
-                <w:szCs w:val="18"/>
+                <w:sz w:val="20"/>
+                <w:szCs w:val="20"/>
+                <w:lang w:val="en-CA"/>
               </w:rPr>
               <w:t>DWOEHOName</w:t>
             </w:r>
             <w:proofErr w:type="spellEnd"/>
             <w:r>
               <w:rPr>
-                <w:color w:val="FF0000"/>
-                <w:sz w:val="18"/>
-                <w:szCs w:val="18"/>
+                <w:sz w:val="20"/>
+                <w:szCs w:val="20"/>
+                <w:lang w:val="en-CA"/>
               </w:rPr>
               <w:t>}}</w:t>
             </w:r>
@@ -468,10 +494,19 @@
             </w:pPr>
             <w:r>
               <w:rPr>
-                <w:sz w:val="18"/>
-                <w:szCs w:val="18"/>
-              </w:rPr>
-              <w:t xml:space="preserve">Phone: </w:t>
+                <w:b/>
+                <w:bCs/>
+                <w:sz w:val="18"/>
+                <w:szCs w:val="18"/>
+              </w:rPr>
+              <w:t>Phone:</w:t>
+            </w:r>
+            <w:r>
+              <w:rPr>
+                <w:sz w:val="18"/>
+                <w:szCs w:val="18"/>
+              </w:rPr>
+              <w:t xml:space="preserve"> </w:t>
             </w:r>
             <w:r>
               <w:rPr>
@@ -482,27 +517,27 @@
             </w:r>
             <w:r>
               <w:rPr>
-                <w:color w:val="FF0000"/>
-                <w:sz w:val="18"/>
-                <w:szCs w:val="18"/>
+                <w:sz w:val="20"/>
+                <w:szCs w:val="20"/>
+                <w:lang w:val="en-CA"/>
               </w:rPr>
               <w:t>{{</w:t>
             </w:r>
             <w:proofErr w:type="spellStart"/>
             <w:r>
               <w:rPr>
-                <w:color w:val="FF0000"/>
-                <w:sz w:val="18"/>
-                <w:szCs w:val="18"/>
+                <w:sz w:val="20"/>
+                <w:szCs w:val="20"/>
+                <w:lang w:val="en-CA"/>
               </w:rPr>
               <w:t>MHOPhoneNumber</w:t>
             </w:r>
             <w:proofErr w:type="spellEnd"/>
             <w:r>
               <w:rPr>
-                <w:color w:val="FF0000"/>
-                <w:sz w:val="18"/>
-                <w:szCs w:val="18"/>
+                <w:sz w:val="20"/>
+                <w:szCs w:val="20"/>
+                <w:lang w:val="en-CA"/>
               </w:rPr>
               <w:t>}}</w:t>
             </w:r>
@@ -532,10 +567,19 @@
             </w:pPr>
             <w:r>
               <w:rPr>
-                <w:sz w:val="18"/>
-                <w:szCs w:val="18"/>
-              </w:rPr>
-              <w:t xml:space="preserve">Phone: </w:t>
+                <w:b/>
+                <w:bCs/>
+                <w:sz w:val="18"/>
+                <w:szCs w:val="18"/>
+              </w:rPr>
+              <w:t>Phone:</w:t>
+            </w:r>
+            <w:r>
+              <w:rPr>
+                <w:sz w:val="18"/>
+                <w:szCs w:val="18"/>
+              </w:rPr>
+              <w:t xml:space="preserve"> </w:t>
             </w:r>
             <w:r>
               <w:rPr>
@@ -546,27 +590,27 @@
             </w:r>
             <w:r>
               <w:rPr>
-                <w:color w:val="FF0000"/>
-                <w:sz w:val="18"/>
-                <w:szCs w:val="18"/>
+                <w:sz w:val="20"/>
+                <w:szCs w:val="20"/>
+                <w:lang w:val="en-CA"/>
               </w:rPr>
               <w:t>{{</w:t>
             </w:r>
             <w:proofErr w:type="spellStart"/>
             <w:r>
               <w:rPr>
-                <w:color w:val="FF0000"/>
-                <w:sz w:val="18"/>
-                <w:szCs w:val="18"/>
+                <w:sz w:val="20"/>
+                <w:szCs w:val="20"/>
+                <w:lang w:val="en-CA"/>
               </w:rPr>
               <w:t>DWOEHOPhoneNumber</w:t>
             </w:r>
             <w:proofErr w:type="spellEnd"/>
             <w:r>
               <w:rPr>
-                <w:color w:val="FF0000"/>
-                <w:sz w:val="18"/>
-                <w:szCs w:val="18"/>
+                <w:sz w:val="20"/>
+                <w:szCs w:val="20"/>
+                <w:lang w:val="en-CA"/>
               </w:rPr>
               <w:t>}}</w:t>
             </w:r>
@@ -619,10 +663,19 @@
             </w:pPr>
             <w:r>
               <w:rPr>
-                <w:sz w:val="18"/>
-                <w:szCs w:val="18"/>
-              </w:rPr>
-              <w:t xml:space="preserve">Email: </w:t>
+                <w:b/>
+                <w:bCs/>
+                <w:sz w:val="18"/>
+                <w:szCs w:val="18"/>
+              </w:rPr>
+              <w:t>Email:</w:t>
+            </w:r>
+            <w:r>
+              <w:rPr>
+                <w:sz w:val="18"/>
+                <w:szCs w:val="18"/>
+              </w:rPr>
+              <w:t xml:space="preserve"> </w:t>
             </w:r>
             <w:r>
               <w:rPr>
@@ -633,27 +686,27 @@
             </w:r>
             <w:r>
               <w:rPr>
-                <w:color w:val="FF0000"/>
-                <w:sz w:val="18"/>
-                <w:szCs w:val="18"/>
+                <w:sz w:val="20"/>
+                <w:szCs w:val="20"/>
+                <w:lang w:val="en-CA"/>
               </w:rPr>
               <w:t>{{</w:t>
             </w:r>
             <w:proofErr w:type="spellStart"/>
             <w:r>
               <w:rPr>
-                <w:color w:val="FF0000"/>
-                <w:sz w:val="18"/>
-                <w:szCs w:val="18"/>
+                <w:sz w:val="20"/>
+                <w:szCs w:val="20"/>
+                <w:lang w:val="en-CA"/>
               </w:rPr>
               <w:t>MHOEmail</w:t>
             </w:r>
             <w:proofErr w:type="spellEnd"/>
             <w:r>
               <w:rPr>
-                <w:color w:val="FF0000"/>
-                <w:sz w:val="18"/>
-                <w:szCs w:val="18"/>
+                <w:sz w:val="20"/>
+                <w:szCs w:val="20"/>
+                <w:lang w:val="en-CA"/>
               </w:rPr>
               <w:t>}}</w:t>
             </w:r>
@@ -682,10 +735,19 @@
             </w:pPr>
             <w:r>
               <w:rPr>
-                <w:sz w:val="18"/>
-                <w:szCs w:val="18"/>
-              </w:rPr>
-              <w:t xml:space="preserve">Email: </w:t>
+                <w:b/>
+                <w:bCs/>
+                <w:sz w:val="18"/>
+                <w:szCs w:val="18"/>
+              </w:rPr>
+              <w:t>Email:</w:t>
+            </w:r>
+            <w:r>
+              <w:rPr>
+                <w:sz w:val="18"/>
+                <w:szCs w:val="18"/>
+              </w:rPr>
+              <w:t xml:space="preserve"> </w:t>
             </w:r>
             <w:r>
               <w:rPr>
@@ -696,27 +758,27 @@
             </w:r>
             <w:r>
               <w:rPr>
-                <w:color w:val="FF0000"/>
-                <w:sz w:val="18"/>
-                <w:szCs w:val="18"/>
+                <w:sz w:val="20"/>
+                <w:szCs w:val="20"/>
+                <w:lang w:val="en-CA"/>
               </w:rPr>
               <w:t>{{</w:t>
             </w:r>
             <w:proofErr w:type="spellStart"/>
             <w:r>
               <w:rPr>
-                <w:color w:val="FF0000"/>
-                <w:sz w:val="18"/>
-                <w:szCs w:val="18"/>
+                <w:sz w:val="20"/>
+                <w:szCs w:val="20"/>
+                <w:lang w:val="en-CA"/>
               </w:rPr>
               <w:t>DWEHOEmail</w:t>
             </w:r>
             <w:proofErr w:type="spellEnd"/>
             <w:r>
               <w:rPr>
-                <w:color w:val="FF0000"/>
-                <w:sz w:val="18"/>
-                <w:szCs w:val="18"/>
+                <w:sz w:val="20"/>
+                <w:szCs w:val="20"/>
+                <w:lang w:val="en-CA"/>
               </w:rPr>
               <w:t>}}</w:t>
             </w:r>
@@ -788,6 +850,8 @@
             </w:pPr>
             <w:r>
               <w:rPr>
+                <w:b/>
+                <w:bCs/>
                 <w:sz w:val="18"/>
                 <w:szCs w:val="18"/>
               </w:rPr>
@@ -802,28 +866,28 @@
             </w:r>
             <w:r>
               <w:rPr>
-                <w:color w:val="FF0000"/>
-                <w:sz w:val="18"/>
-                <w:szCs w:val="18"/>
+                <w:sz w:val="20"/>
+                <w:szCs w:val="20"/>
+                <w:lang w:val="en-CA"/>
               </w:rPr>
               <w:t>{{</w:t>
             </w:r>
             <w:proofErr w:type="spellStart"/>
             <w:r>
               <w:rPr>
-                <w:color w:val="FF0000"/>
-                <w:sz w:val="18"/>
-                <w:szCs w:val="18"/>
-              </w:rPr>
-              <w:t>CollectedBy</w:t>
+                <w:sz w:val="20"/>
+                <w:szCs w:val="20"/>
+                <w:lang w:val="en-CA"/>
+              </w:rPr>
+              <w:t>SamplerName</w:t>
             </w:r>
             <w:proofErr w:type="spellEnd"/>
             <w:proofErr w:type="gramStart"/>
             <w:r>
               <w:rPr>
-                <w:color w:val="FF0000"/>
-                <w:sz w:val="18"/>
-                <w:szCs w:val="18"/>
+                <w:sz w:val="20"/>
+                <w:szCs w:val="20"/>
+                <w:lang w:val="en-CA"/>
               </w:rPr>
               <w:t>}}</w:t>
             </w:r>
@@ -858,10 +922,19 @@
             </w:pPr>
             <w:r>
               <w:rPr>
-                <w:sz w:val="18"/>
-                <w:szCs w:val="18"/>
-              </w:rPr>
-              <w:t xml:space="preserve">Collection Date Time: </w:t>
+                <w:b/>
+                <w:bCs/>
+                <w:sz w:val="18"/>
+                <w:szCs w:val="18"/>
+              </w:rPr>
+              <w:t>Collection Date Time:</w:t>
+            </w:r>
+            <w:r>
+              <w:rPr>
+                <w:sz w:val="18"/>
+                <w:szCs w:val="18"/>
+              </w:rPr>
+              <w:t xml:space="preserve"> </w:t>
             </w:r>
             <w:r>
               <w:rPr>
@@ -872,27 +945,27 @@
             </w:r>
             <w:r>
               <w:rPr>
-                <w:color w:val="FF0000"/>
-                <w:sz w:val="18"/>
-                <w:szCs w:val="18"/>
+                <w:sz w:val="20"/>
+                <w:szCs w:val="20"/>
+                <w:lang w:val="en-CA"/>
               </w:rPr>
               <w:t>{{</w:t>
             </w:r>
             <w:proofErr w:type="spellStart"/>
             <w:r>
               <w:rPr>
-                <w:color w:val="FF0000"/>
-                <w:sz w:val="18"/>
-                <w:szCs w:val="18"/>
+                <w:sz w:val="20"/>
+                <w:szCs w:val="20"/>
+                <w:lang w:val="en-CA"/>
               </w:rPr>
               <w:t>CollectionDateTime</w:t>
             </w:r>
             <w:proofErr w:type="spellEnd"/>
             <w:r>
               <w:rPr>
-                <w:color w:val="FF0000"/>
-                <w:sz w:val="18"/>
-                <w:szCs w:val="18"/>
+                <w:sz w:val="20"/>
+                <w:szCs w:val="20"/>
+                <w:lang w:val="en-CA"/>
               </w:rPr>
               <w:t>}}</w:t>
             </w:r>
@@ -926,6 +999,8 @@
             </w:pPr>
             <w:r>
               <w:rPr>
+                <w:b/>
+                <w:bCs/>
                 <w:sz w:val="18"/>
                 <w:szCs w:val="18"/>
               </w:rPr>
@@ -933,6 +1008,8 @@
             </w:r>
             <w:r>
               <w:rPr>
+                <w:b/>
+                <w:bCs/>
                 <w:sz w:val="18"/>
                 <w:szCs w:val="18"/>
               </w:rPr>
@@ -941,10 +1018,12 @@
             <w:proofErr w:type="gramStart"/>
             <w:r>
               <w:rPr>
-                <w:sz w:val="18"/>
-                <w:szCs w:val="18"/>
-              </w:rPr>
-              <w:t xml:space="preserve">: </w:t>
+                <w:b/>
+                <w:bCs/>
+                <w:sz w:val="18"/>
+                <w:szCs w:val="18"/>
+              </w:rPr>
+              <w:t>:</w:t>
             </w:r>
             <w:r>
               <w:rPr>
@@ -955,36 +1034,123 @@
             </w:r>
             <w:r>
               <w:rPr>
+                <w:sz w:val="18"/>
+                <w:szCs w:val="18"/>
+              </w:rPr>
+              <w:t xml:space="preserve"> </w:t>
+            </w:r>
+            <w:r>
+              <w:rPr>
+                <w:sz w:val="20"/>
+                <w:szCs w:val="20"/>
+                <w:lang w:val="en-CA"/>
+              </w:rPr>
+              <w:t>{</w:t>
+            </w:r>
+            <w:proofErr w:type="gramEnd"/>
+            <w:r>
+              <w:rPr>
+                <w:sz w:val="20"/>
+                <w:szCs w:val="20"/>
+                <w:lang w:val="en-CA"/>
+              </w:rPr>
+              <w:t>{</w:t>
+            </w:r>
+            <w:proofErr w:type="spellStart"/>
+            <w:r>
+              <w:rPr>
+                <w:sz w:val="20"/>
+                <w:szCs w:val="20"/>
+                <w:lang w:val="en-CA"/>
+              </w:rPr>
+              <w:t>FacilityName</w:t>
+            </w:r>
+            <w:proofErr w:type="spellEnd"/>
+            <w:r>
+              <w:rPr>
+                <w:sz w:val="20"/>
+                <w:szCs w:val="20"/>
+                <w:lang w:val="en-CA"/>
+              </w:rPr>
+              <w:t>}}</w:t>
+            </w:r>
+          </w:p>
+          <w:p>
+            <w:pPr>
+              <w:spacing w:line="276" w:lineRule="auto"/>
+              <w:rPr>
                 <w:color w:val="FF0000"/>
                 <w:sz w:val="18"/>
                 <w:szCs w:val="18"/>
               </w:rPr>
+            </w:pPr>
+            <w:r>
+              <w:rPr>
+                <w:b/>
+                <w:bCs/>
+                <w:sz w:val="18"/>
+                <w:szCs w:val="18"/>
+              </w:rPr>
+              <w:t>PHOCS Account Number</w:t>
+            </w:r>
+            <w:proofErr w:type="gramStart"/>
+            <w:r>
+              <w:rPr>
+                <w:b/>
+                <w:bCs/>
+                <w:sz w:val="18"/>
+                <w:szCs w:val="18"/>
+              </w:rPr>
+              <w:t>:</w:t>
+            </w:r>
+            <w:r>
+              <w:rPr>
+                <w:color w:val="FF0000"/>
+                <w:sz w:val="18"/>
+                <w:szCs w:val="18"/>
+              </w:rPr>
+              <w:t xml:space="preserve"> </w:t>
+            </w:r>
+            <w:r>
+              <w:rPr>
+                <w:color w:val="FF0000"/>
+                <w:sz w:val="18"/>
+                <w:szCs w:val="18"/>
+              </w:rPr>
+              <w:t xml:space="preserve"> </w:t>
+            </w:r>
+            <w:r>
+              <w:rPr>
+                <w:sz w:val="20"/>
+                <w:szCs w:val="20"/>
+                <w:lang w:val="en-CA"/>
+              </w:rPr>
               <w:t>{</w:t>
             </w:r>
             <w:proofErr w:type="gramEnd"/>
             <w:r>
               <w:rPr>
-                <w:color w:val="FF0000"/>
-                <w:sz w:val="18"/>
-                <w:szCs w:val="18"/>
+                <w:sz w:val="20"/>
+                <w:szCs w:val="20"/>
+                <w:lang w:val="en-CA"/>
               </w:rPr>
               <w:t>{</w:t>
             </w:r>
             <w:proofErr w:type="spellStart"/>
             <w:r>
               <w:rPr>
-                <w:color w:val="FF0000"/>
-                <w:sz w:val="18"/>
-                <w:szCs w:val="18"/>
-              </w:rPr>
-              <w:t>FacilityName</w:t>
+                <w:sz w:val="20"/>
+                <w:szCs w:val="20"/>
+                <w:lang w:val="en-CA"/>
+              </w:rPr>
+              <w:t>FacilityAccountNumber</w:t>
             </w:r>
             <w:proofErr w:type="spellEnd"/>
             <w:r>
               <w:rPr>
-                <w:color w:val="FF0000"/>
-                <w:sz w:val="18"/>
-                <w:szCs w:val="18"/>
+                <w:sz w:val="20"/>
+                <w:szCs w:val="20"/>
+                <w:lang w:val="en-CA"/>
               </w:rPr>
               <w:t>}}</w:t>
             </w:r>
@@ -993,17 +1159,38 @@
             <w:pPr>
               <w:spacing w:line="276" w:lineRule="auto"/>
               <w:rPr>
-                <w:color w:val="FF0000"/>
-                <w:sz w:val="18"/>
-                <w:szCs w:val="18"/>
-              </w:rPr>
-            </w:pPr>
-            <w:r>
-              <w:rPr>
-                <w:sz w:val="18"/>
-                <w:szCs w:val="18"/>
-              </w:rPr>
-              <w:t>PHOCS Account Number</w:t>
+                <w:b/>
+                <w:bCs/>
+                <w:sz w:val="18"/>
+                <w:szCs w:val="18"/>
+              </w:rPr>
+            </w:pPr>
+            <w:r>
+              <w:rPr>
+                <w:b/>
+                <w:bCs/>
+                <w:sz w:val="18"/>
+                <w:szCs w:val="18"/>
+              </w:rPr>
+              <w:t xml:space="preserve">System Type: </w:t>
+            </w:r>
+          </w:p>
+          <w:p>
+            <w:pPr>
+              <w:spacing w:line="276" w:lineRule="auto"/>
+              <w:rPr>
+                <w:sz w:val="18"/>
+                <w:szCs w:val="18"/>
+              </w:rPr>
+            </w:pPr>
+            <w:r>
+              <w:rPr>
+                <w:b/>
+                <w:bCs/>
+                <w:sz w:val="18"/>
+                <w:szCs w:val="18"/>
+              </w:rPr>
+              <w:t>Population</w:t>
             </w:r>
             <w:proofErr w:type="gramStart"/>
             <w:r>
@@ -1011,138 +1198,40 @@
                 <w:sz w:val="18"/>
                 <w:szCs w:val="18"/>
               </w:rPr>
-              <w:t>:</w:t>
-            </w:r>
-            <w:r>
-              <w:rPr>
-                <w:color w:val="FF0000"/>
-                <w:sz w:val="18"/>
-                <w:szCs w:val="18"/>
-              </w:rPr>
-              <w:t xml:space="preserve"> </w:t>
-            </w:r>
-            <w:r>
-              <w:rPr>
-                <w:color w:val="FF0000"/>
-                <w:sz w:val="18"/>
-                <w:szCs w:val="18"/>
-              </w:rPr>
-              <w:t xml:space="preserve"> </w:t>
-            </w:r>
-            <w:r>
-              <w:rPr>
-                <w:color w:val="FF0000"/>
-                <w:sz w:val="18"/>
-                <w:szCs w:val="18"/>
+              <w:t xml:space="preserve">:  </w:t>
+            </w:r>
+            <w:r>
+              <w:rPr>
+                <w:sz w:val="20"/>
+                <w:szCs w:val="20"/>
+                <w:lang w:val="en-CA"/>
               </w:rPr>
               <w:t>{</w:t>
             </w:r>
             <w:proofErr w:type="gramEnd"/>
             <w:r>
               <w:rPr>
-                <w:color w:val="FF0000"/>
-                <w:sz w:val="18"/>
-                <w:szCs w:val="18"/>
-              </w:rPr>
-              <w:t>{</w:t>
+                <w:sz w:val="20"/>
+                <w:szCs w:val="20"/>
+                <w:lang w:val="en-CA"/>
+              </w:rPr>
+              <w:t>{#IF_IsDrinkingWaterSystem}} {{FacilityPopulationServedper24hrs}} {{/</w:t>
             </w:r>
             <w:proofErr w:type="spellStart"/>
             <w:r>
               <w:rPr>
-                <w:color w:val="FF0000"/>
-                <w:sz w:val="18"/>
-                <w:szCs w:val="18"/>
-              </w:rPr>
-              <w:t>FacilityAccountNumber</w:t>
+                <w:sz w:val="20"/>
+                <w:szCs w:val="20"/>
+                <w:lang w:val="en-CA"/>
+              </w:rPr>
+              <w:t>IF_IsDrinkingWaterSystem</w:t>
             </w:r>
             <w:proofErr w:type="spellEnd"/>
             <w:r>
               <w:rPr>
-                <w:color w:val="FF0000"/>
-                <w:sz w:val="18"/>
-                <w:szCs w:val="18"/>
-              </w:rPr>
-              <w:t>}}</w:t>
-            </w:r>
-          </w:p>
-          <w:p>
-            <w:pPr>
-              <w:spacing w:line="276" w:lineRule="auto"/>
-              <w:rPr>
-                <w:sz w:val="18"/>
-                <w:szCs w:val="18"/>
-              </w:rPr>
-            </w:pPr>
-            <w:r>
-              <w:rPr>
-                <w:sz w:val="18"/>
-                <w:szCs w:val="18"/>
-              </w:rPr>
-              <w:t>System Type</w:t>
-            </w:r>
-            <w:r>
-              <w:rPr>
-                <w:sz w:val="18"/>
-                <w:szCs w:val="18"/>
-              </w:rPr>
-              <w:t xml:space="preserve">: </w:t>
-            </w:r>
-          </w:p>
-          <w:p>
-            <w:pPr>
-              <w:spacing w:line="276" w:lineRule="auto"/>
-              <w:rPr>
-                <w:sz w:val="18"/>
-                <w:szCs w:val="18"/>
-              </w:rPr>
-            </w:pPr>
-            <w:r>
-              <w:rPr>
-                <w:sz w:val="18"/>
-                <w:szCs w:val="18"/>
-              </w:rPr>
-              <w:t>Population</w:t>
-            </w:r>
-            <w:proofErr w:type="gramStart"/>
-            <w:r>
-              <w:rPr>
-                <w:sz w:val="18"/>
-                <w:szCs w:val="18"/>
-              </w:rPr>
-              <w:t xml:space="preserve">:  </w:t>
-            </w:r>
-            <w:r>
-              <w:rPr>
-                <w:color w:val="FF0000"/>
-                <w:sz w:val="18"/>
-                <w:szCs w:val="18"/>
-              </w:rPr>
-              <w:t>{</w:t>
-            </w:r>
-            <w:proofErr w:type="gramEnd"/>
-            <w:r>
-              <w:rPr>
-                <w:color w:val="FF0000"/>
-                <w:sz w:val="18"/>
-                <w:szCs w:val="18"/>
-              </w:rPr>
-              <w:t>{#IF_IsDrinkingWaterSystem}} {{FacilityPopulationServedper24hrs}} {{/</w:t>
-            </w:r>
-            <w:proofErr w:type="spellStart"/>
-            <w:r>
-              <w:rPr>
-                <w:color w:val="FF0000"/>
-                <w:sz w:val="18"/>
-                <w:szCs w:val="18"/>
-              </w:rPr>
-              <w:t>IF_IsDrinkingWaterSystem</w:t>
-            </w:r>
-            <w:proofErr w:type="spellEnd"/>
-            <w:r>
-              <w:rPr>
-                <w:color w:val="FF0000"/>
-                <w:sz w:val="18"/>
-                <w:szCs w:val="18"/>
+                <w:sz w:val="20"/>
+                <w:szCs w:val="20"/>
+                <w:lang w:val="en-CA"/>
               </w:rPr>
               <w:t>}}</w:t>
             </w:r>
@@ -1168,12 +1257,16 @@
             <w:pPr>
               <w:spacing w:line="276" w:lineRule="auto"/>
               <w:rPr>
-                <w:sz w:val="18"/>
-                <w:szCs w:val="18"/>
-              </w:rPr>
-            </w:pPr>
-            <w:r>
-              <w:rPr>
+                <w:b/>
+                <w:bCs/>
+                <w:sz w:val="18"/>
+                <w:szCs w:val="18"/>
+              </w:rPr>
+            </w:pPr>
+            <w:r>
+              <w:rPr>
+                <w:b/>
+                <w:bCs/>
                 <w:sz w:val="18"/>
                 <w:szCs w:val="18"/>
               </w:rPr>
@@ -1184,12 +1277,16 @@
             <w:pPr>
               <w:spacing w:line="276" w:lineRule="auto"/>
               <w:rPr>
-                <w:sz w:val="18"/>
-                <w:szCs w:val="18"/>
-              </w:rPr>
-            </w:pPr>
-            <w:r>
-              <w:rPr>
+                <w:b/>
+                <w:bCs/>
+                <w:sz w:val="18"/>
+                <w:szCs w:val="18"/>
+              </w:rPr>
+            </w:pPr>
+            <w:r>
+              <w:rPr>
+                <w:b/>
+                <w:bCs/>
                 <w:sz w:val="18"/>
                 <w:szCs w:val="18"/>
               </w:rPr>
@@ -1200,12 +1297,16 @@
             <w:pPr>
               <w:spacing w:line="276" w:lineRule="auto"/>
               <w:rPr>
-                <w:sz w:val="18"/>
-                <w:szCs w:val="18"/>
-              </w:rPr>
-            </w:pPr>
-            <w:r>
-              <w:rPr>
+                <w:b/>
+                <w:bCs/>
+                <w:sz w:val="18"/>
+                <w:szCs w:val="18"/>
+              </w:rPr>
+            </w:pPr>
+            <w:r>
+              <w:rPr>
+                <w:b/>
+                <w:bCs/>
                 <w:sz w:val="18"/>
                 <w:szCs w:val="18"/>
               </w:rPr>
@@ -1222,6 +1323,8 @@
             </w:pPr>
             <w:r>
               <w:rPr>
+                <w:b/>
+                <w:bCs/>
                 <w:sz w:val="18"/>
                 <w:szCs w:val="18"/>
               </w:rPr>
@@ -1230,57 +1333,62 @@
             <w:proofErr w:type="gramStart"/>
             <w:r>
               <w:rPr>
-                <w:sz w:val="18"/>
-                <w:szCs w:val="18"/>
+                <w:b/>
+                <w:bCs/>
+                <w:sz w:val="20"/>
+                <w:szCs w:val="20"/>
+                <w:lang w:val="en-CA"/>
               </w:rPr>
               <w:t>:</w:t>
             </w:r>
             <w:r>
               <w:rPr>
-                <w:sz w:val="18"/>
-                <w:szCs w:val="18"/>
+                <w:sz w:val="20"/>
+                <w:szCs w:val="20"/>
+                <w:lang w:val="en-CA"/>
               </w:rPr>
               <w:t xml:space="preserve"> </w:t>
             </w:r>
             <w:r>
               <w:rPr>
-                <w:sz w:val="18"/>
-                <w:szCs w:val="18"/>
+                <w:sz w:val="20"/>
+                <w:szCs w:val="20"/>
+                <w:lang w:val="en-CA"/>
               </w:rPr>
               <w:t xml:space="preserve"> </w:t>
             </w:r>
             <w:r>
               <w:rPr>
-                <w:color w:val="FF0000"/>
-                <w:sz w:val="18"/>
-                <w:szCs w:val="18"/>
+                <w:sz w:val="20"/>
+                <w:szCs w:val="20"/>
+                <w:lang w:val="en-CA"/>
               </w:rPr>
               <w:t>{</w:t>
             </w:r>
             <w:proofErr w:type="gramEnd"/>
             <w:r>
               <w:rPr>
-                <w:color w:val="FF0000"/>
-                <w:sz w:val="18"/>
-                <w:szCs w:val="18"/>
+                <w:sz w:val="20"/>
+                <w:szCs w:val="20"/>
+                <w:lang w:val="en-CA"/>
               </w:rPr>
               <w:t>{</w:t>
             </w:r>
             <w:proofErr w:type="spellStart"/>
             <w:r>
               <w:rPr>
-                <w:color w:val="FF0000"/>
-                <w:sz w:val="18"/>
-                <w:szCs w:val="18"/>
+                <w:sz w:val="20"/>
+                <w:szCs w:val="20"/>
+                <w:lang w:val="en-CA"/>
               </w:rPr>
               <w:t>SpecimenSource</w:t>
             </w:r>
             <w:proofErr w:type="spellEnd"/>
             <w:r>
               <w:rPr>
-                <w:color w:val="FF0000"/>
-                <w:sz w:val="18"/>
-                <w:szCs w:val="18"/>
+                <w:sz w:val="20"/>
+                <w:szCs w:val="20"/>
+                <w:lang w:val="en-CA"/>
               </w:rPr>
               <w:t>}}</w:t>
             </w:r>
@@ -1313,34 +1421,43 @@
             </w:pPr>
             <w:r>
               <w:rPr>
-                <w:sz w:val="18"/>
-                <w:szCs w:val="18"/>
-              </w:rPr>
-              <w:t xml:space="preserve">Health Unit to Receive Report: </w:t>
-            </w:r>
-            <w:r>
-              <w:rPr>
-                <w:color w:val="FF0000"/>
-                <w:sz w:val="18"/>
-                <w:szCs w:val="18"/>
+                <w:b/>
+                <w:bCs/>
+                <w:sz w:val="18"/>
+                <w:szCs w:val="18"/>
+              </w:rPr>
+              <w:t>Health Unit to Receive Report</w:t>
+            </w:r>
+            <w:r>
+              <w:rPr>
+                <w:sz w:val="18"/>
+                <w:szCs w:val="18"/>
+              </w:rPr>
+              <w:t xml:space="preserve">: </w:t>
+            </w:r>
+            <w:r>
+              <w:rPr>
+                <w:sz w:val="20"/>
+                <w:szCs w:val="20"/>
+                <w:lang w:val="en-CA"/>
               </w:rPr>
               <w:t>{{</w:t>
             </w:r>
             <w:proofErr w:type="spellStart"/>
             <w:r>
               <w:rPr>
-                <w:color w:val="FF0000"/>
-                <w:sz w:val="18"/>
-                <w:szCs w:val="18"/>
+                <w:sz w:val="20"/>
+                <w:szCs w:val="20"/>
+                <w:lang w:val="en-CA"/>
               </w:rPr>
               <w:t>HealthAuthority</w:t>
             </w:r>
             <w:proofErr w:type="spellEnd"/>
             <w:r>
               <w:rPr>
-                <w:color w:val="FF0000"/>
-                <w:sz w:val="18"/>
-                <w:szCs w:val="18"/>
+                <w:sz w:val="20"/>
+                <w:szCs w:val="20"/>
+                <w:lang w:val="en-CA"/>
               </w:rPr>
               <w:t>}}</w:t>
             </w:r>
@@ -1355,6 +1472,8 @@
             </w:pPr>
             <w:r>
               <w:rPr>
+                <w:b/>
+                <w:bCs/>
                 <w:sz w:val="18"/>
                 <w:szCs w:val="18"/>
               </w:rPr>
@@ -1363,6 +1482,8 @@
             <w:proofErr w:type="gramStart"/>
             <w:r>
               <w:rPr>
+                <w:b/>
+                <w:bCs/>
                 <w:sz w:val="18"/>
                 <w:szCs w:val="18"/>
               </w:rPr>
@@ -1384,36 +1505,35 @@
             </w:r>
             <w:r>
               <w:rPr>
-                <w:color w:val="FF0000"/>
-                <w:sz w:val="18"/>
-                <w:szCs w:val="18"/>
+                <w:sz w:val="20"/>
+                <w:szCs w:val="20"/>
+                <w:lang w:val="en-CA"/>
               </w:rPr>
               <w:t>{</w:t>
             </w:r>
             <w:proofErr w:type="gramEnd"/>
             <w:r>
               <w:rPr>
-                <w:color w:val="FF0000"/>
-                <w:sz w:val="18"/>
-                <w:szCs w:val="18"/>
+                <w:sz w:val="20"/>
+                <w:szCs w:val="20"/>
+                <w:lang w:val="en-CA"/>
               </w:rPr>
               <w:t>{</w:t>
             </w:r>
             <w:proofErr w:type="spellStart"/>
             <w:r>
               <w:rPr>
-                <w:color w:val="FF0000"/>
-                <w:sz w:val="18"/>
-                <w:szCs w:val="18"/>
-              </w:rPr>
-              <w:t>CopyTo</w:t>
+                <w:sz w:val="20"/>
+                <w:szCs w:val="20"/>
+              </w:rPr>
+              <w:t>AdditionalReportRecipients</w:t>
             </w:r>
             <w:proofErr w:type="spellEnd"/>
             <w:r>
               <w:rPr>
-                <w:color w:val="FF0000"/>
-                <w:sz w:val="18"/>
-                <w:szCs w:val="18"/>
+                <w:sz w:val="20"/>
+                <w:szCs w:val="20"/>
+                <w:lang w:val="en-CA"/>
               </w:rPr>
               <w:t>}}</w:t>
             </w:r>
@@ -1446,6 +1566,8 @@
             </w:pPr>
             <w:r>
               <w:rPr>
+                <w:b/>
+                <w:bCs/>
                 <w:sz w:val="18"/>
                 <w:szCs w:val="18"/>
               </w:rPr>
@@ -1454,16 +1576,25 @@
             <w:proofErr w:type="gramStart"/>
             <w:r>
               <w:rPr>
-                <w:sz w:val="18"/>
-                <w:szCs w:val="18"/>
-              </w:rPr>
-              <w:t xml:space="preserve">Purpose: </w:t>
-            </w:r>
-            <w:r>
-              <w:rPr>
-                <w:color w:val="FF0000"/>
-                <w:sz w:val="18"/>
-                <w:szCs w:val="18"/>
+                <w:b/>
+                <w:bCs/>
+                <w:sz w:val="18"/>
+                <w:szCs w:val="18"/>
+              </w:rPr>
+              <w:t>Purpose:</w:t>
+            </w:r>
+            <w:r>
+              <w:rPr>
+                <w:sz w:val="18"/>
+                <w:szCs w:val="18"/>
+              </w:rPr>
+              <w:t xml:space="preserve"> </w:t>
+            </w:r>
+            <w:r>
+              <w:rPr>
+                <w:sz w:val="20"/>
+                <w:szCs w:val="20"/>
+                <w:lang w:val="en-CA"/>
               </w:rPr>
               <w:t>{{</w:t>
             </w:r>
@@ -1471,18 +1602,78 @@
             <w:proofErr w:type="gramEnd"/>
             <w:r>
               <w:rPr>
+                <w:sz w:val="20"/>
+                <w:szCs w:val="20"/>
+                <w:lang w:val="en-CA"/>
+              </w:rPr>
+              <w:t>SampleReason</w:t>
+            </w:r>
+            <w:proofErr w:type="spellEnd"/>
+            <w:r>
+              <w:rPr>
+                <w:sz w:val="20"/>
+                <w:szCs w:val="20"/>
+                <w:lang w:val="en-CA"/>
+              </w:rPr>
+              <w:t>}}</w:t>
+            </w:r>
+          </w:p>
+          <w:p>
+            <w:pPr>
+              <w:spacing w:line="276" w:lineRule="auto"/>
+              <w:rPr>
+                <w:sz w:val="20"/>
+                <w:szCs w:val="20"/>
+                <w:lang w:val="en-CA"/>
+              </w:rPr>
+            </w:pPr>
+            <w:r>
+              <w:rPr>
+                <w:b/>
+                <w:bCs/>
+                <w:sz w:val="18"/>
+                <w:szCs w:val="18"/>
+              </w:rPr>
+              <w:t>Outbreak Sample</w:t>
+            </w:r>
+            <w:r>
+              <w:rPr>
+                <w:sz w:val="18"/>
+                <w:szCs w:val="18"/>
+              </w:rPr>
+              <w:t>:</w:t>
+            </w:r>
+            <w:r>
+              <w:rPr>
                 <w:color w:val="FF0000"/>
                 <w:sz w:val="18"/>
                 <w:szCs w:val="18"/>
               </w:rPr>
-              <w:t>SampleReason</w:t>
+              <w:t xml:space="preserve"> </w:t>
+            </w:r>
+            <w:r>
+              <w:rPr>
+                <w:sz w:val="20"/>
+                <w:szCs w:val="20"/>
+                <w:lang w:val="en-CA"/>
+              </w:rPr>
+              <w:t>{{</w:t>
+            </w:r>
+            <w:proofErr w:type="spellStart"/>
+            <w:r>
+              <w:rPr>
+                <w:sz w:val="20"/>
+                <w:szCs w:val="20"/>
+                <w:lang w:val="en-CA"/>
+              </w:rPr>
+              <w:t>OutbreakSample</w:t>
             </w:r>
             <w:proofErr w:type="spellEnd"/>
             <w:r>
               <w:rPr>
-                <w:color w:val="FF0000"/>
-                <w:sz w:val="18"/>
-                <w:szCs w:val="18"/>
+                <w:sz w:val="20"/>
+                <w:szCs w:val="20"/>
+                <w:lang w:val="en-CA"/>
               </w:rPr>
               <w:t>}}</w:t>
             </w:r>
@@ -1497,14 +1688,15 @@
             </w:pPr>
             <w:r>
               <w:rPr>
-                <w:sz w:val="18"/>
-                <w:szCs w:val="18"/>
-              </w:rPr>
-              <w:t>Outbreak Sample:</w:t>
-            </w:r>
-            <w:r>
-              <w:rPr>
-                <w:color w:val="FF0000"/>
+                <w:b/>
+                <w:bCs/>
+                <w:sz w:val="18"/>
+                <w:szCs w:val="18"/>
+              </w:rPr>
+              <w:t>Is the Water System on Boil Advisory?</w:t>
+            </w:r>
+            <w:r>
+              <w:rPr>
                 <w:sz w:val="18"/>
                 <w:szCs w:val="18"/>
               </w:rPr>
@@ -1512,69 +1704,35 @@
             </w:r>
             <w:r>
               <w:rPr>
-                <w:color w:val="FF0000"/>
-                <w:sz w:val="18"/>
-                <w:szCs w:val="18"/>
+                <w:sz w:val="20"/>
+                <w:szCs w:val="20"/>
+                <w:lang w:val="en-CA"/>
+              </w:rPr>
+              <w:t xml:space="preserve"> </w:t>
+            </w:r>
+            <w:r>
+              <w:rPr>
+                <w:sz w:val="20"/>
+                <w:szCs w:val="20"/>
+                <w:lang w:val="en-CA"/>
               </w:rPr>
               <w:t>{{</w:t>
             </w:r>
             <w:proofErr w:type="spellStart"/>
             <w:r>
               <w:rPr>
-                <w:color w:val="FF0000"/>
-                <w:sz w:val="18"/>
-                <w:szCs w:val="18"/>
-              </w:rPr>
-              <w:t>OutbreakSample</w:t>
+                <w:sz w:val="20"/>
+                <w:szCs w:val="20"/>
+                <w:lang w:val="en-CA"/>
+              </w:rPr>
+              <w:t>BoilAdvisory</w:t>
             </w:r>
             <w:proofErr w:type="spellEnd"/>
             <w:r>
               <w:rPr>
-                <w:color w:val="FF0000"/>
-                <w:sz w:val="18"/>
-                <w:szCs w:val="18"/>
-              </w:rPr>
-              <w:t>}}</w:t>
-            </w:r>
-          </w:p>
-          <w:p>
-            <w:pPr>
-              <w:spacing w:line="276" w:lineRule="auto"/>
-              <w:rPr>
-                <w:sz w:val="18"/>
-                <w:szCs w:val="18"/>
-              </w:rPr>
-            </w:pPr>
-            <w:r>
-              <w:rPr>
-                <w:sz w:val="18"/>
-                <w:szCs w:val="18"/>
-              </w:rPr>
-              <w:t xml:space="preserve">Is the Water System on Boil Advisory?  </w:t>
-            </w:r>
-            <w:r>
-              <w:rPr>
-                <w:color w:val="FF0000"/>
-                <w:sz w:val="18"/>
-                <w:szCs w:val="18"/>
-              </w:rPr>
-              <w:t>{{</w:t>
-            </w:r>
-            <w:proofErr w:type="spellStart"/>
-            <w:r>
-              <w:rPr>
-                <w:color w:val="FF0000"/>
-                <w:sz w:val="18"/>
-                <w:szCs w:val="18"/>
-              </w:rPr>
-              <w:t>BoilAdvisory</w:t>
-            </w:r>
-            <w:proofErr w:type="spellEnd"/>
-            <w:r>
-              <w:rPr>
-                <w:color w:val="FF0000"/>
-                <w:sz w:val="18"/>
-                <w:szCs w:val="18"/>
+                <w:sz w:val="20"/>
+                <w:szCs w:val="20"/>
+                <w:lang w:val="en-CA"/>
               </w:rPr>
               <w:t>}}</w:t>
             </w:r>
@@ -1583,7 +1741,7 @@
       </w:tr>
       <w:tr>
         <w:trPr>
-          <w:trHeight w:val="586"/>
+          <w:trHeight w:val="437"/>
         </w:trPr>
         <w:tc>
           <w:tcPr>
@@ -1598,14 +1756,16 @@
           </w:tcPr>
           <w:p>
             <w:pPr>
-              <w:spacing w:line="276" w:lineRule="auto"/>
-              <w:rPr>
-                <w:sz w:val="18"/>
-                <w:szCs w:val="18"/>
-              </w:rPr>
-            </w:pPr>
-            <w:r>
-              <w:rPr>
+              <w:spacing w:before="120" w:line="276" w:lineRule="auto"/>
+              <w:rPr>
+                <w:sz w:val="18"/>
+                <w:szCs w:val="18"/>
+              </w:rPr>
+            </w:pPr>
+            <w:r>
+              <w:rPr>
+                <w:b/>
+                <w:bCs/>
                 <w:sz w:val="18"/>
                 <w:szCs w:val="18"/>
               </w:rPr>
@@ -1614,6 +1774,8 @@
             <w:proofErr w:type="gramStart"/>
             <w:r>
               <w:rPr>
+                <w:b/>
+                <w:bCs/>
                 <w:sz w:val="18"/>
                 <w:szCs w:val="18"/>
               </w:rPr>
@@ -1635,102 +1797,36 @@
             </w:r>
             <w:r>
               <w:rPr>
-                <w:color w:val="FF0000"/>
-                <w:sz w:val="18"/>
-                <w:szCs w:val="18"/>
+                <w:sz w:val="20"/>
+                <w:szCs w:val="20"/>
+                <w:lang w:val="en-CA"/>
               </w:rPr>
               <w:t>{</w:t>
             </w:r>
             <w:proofErr w:type="gramEnd"/>
             <w:r>
               <w:rPr>
-                <w:color w:val="FF0000"/>
-                <w:sz w:val="18"/>
-                <w:szCs w:val="18"/>
+                <w:sz w:val="20"/>
+                <w:szCs w:val="20"/>
+                <w:lang w:val="en-CA"/>
               </w:rPr>
               <w:t>{</w:t>
             </w:r>
             <w:proofErr w:type="spellStart"/>
             <w:r>
               <w:rPr>
-                <w:color w:val="FF0000"/>
-                <w:sz w:val="18"/>
-                <w:szCs w:val="18"/>
+                <w:sz w:val="20"/>
+                <w:szCs w:val="20"/>
+                <w:lang w:val="en-CA"/>
               </w:rPr>
               <w:t>ToLaboratory</w:t>
             </w:r>
             <w:proofErr w:type="spellEnd"/>
             <w:r>
               <w:rPr>
-                <w:color w:val="FF0000"/>
-                <w:sz w:val="18"/>
-                <w:szCs w:val="18"/>
-              </w:rPr>
-              <w:t>}}</w:t>
-            </w:r>
-          </w:p>
-          <w:p>
-            <w:pPr>
-              <w:spacing w:line="276" w:lineRule="auto"/>
-              <w:rPr>
-                <w:sz w:val="18"/>
-                <w:szCs w:val="18"/>
-              </w:rPr>
-            </w:pPr>
-            <w:r>
-              <w:rPr>
-                <w:sz w:val="18"/>
-                <w:szCs w:val="18"/>
-              </w:rPr>
-              <w:t>Send Additional Copy To</w:t>
-            </w:r>
-            <w:proofErr w:type="gramStart"/>
-            <w:r>
-              <w:rPr>
-                <w:sz w:val="18"/>
-                <w:szCs w:val="18"/>
-              </w:rPr>
-              <w:t xml:space="preserve">: </w:t>
-            </w:r>
-            <w:r>
-              <w:rPr>
-                <w:sz w:val="18"/>
-                <w:szCs w:val="18"/>
-              </w:rPr>
-              <w:t xml:space="preserve"> </w:t>
-            </w:r>
-            <w:r>
-              <w:rPr>
-                <w:color w:val="FF0000"/>
-                <w:sz w:val="18"/>
-                <w:szCs w:val="18"/>
-              </w:rPr>
-              <w:t>{</w:t>
-            </w:r>
-            <w:proofErr w:type="gramEnd"/>
-            <w:r>
-              <w:rPr>
-                <w:color w:val="FF0000"/>
-                <w:sz w:val="18"/>
-                <w:szCs w:val="18"/>
-              </w:rPr>
-              <w:t>{</w:t>
-            </w:r>
-            <w:proofErr w:type="spellStart"/>
-            <w:r>
-              <w:rPr>
-                <w:color w:val="FF0000"/>
-                <w:sz w:val="18"/>
-                <w:szCs w:val="18"/>
-              </w:rPr>
-              <w:t>CopyTo</w:t>
-            </w:r>
-            <w:proofErr w:type="spellEnd"/>
-            <w:r>
-              <w:rPr>
-                <w:color w:val="FF0000"/>
-                <w:sz w:val="18"/>
-                <w:szCs w:val="18"/>
+                <w:sz w:val="20"/>
+                <w:szCs w:val="20"/>
+                <w:lang w:val="en-CA"/>
               </w:rPr>
               <w:t>}}</w:t>
             </w:r>
@@ -1743,18 +1839,19 @@
       <w:tblPr>
         <w:tblStyle w:val="TableGrid"/>
         <w:tblW w:w="0" w:type="auto"/>
+        <w:tblLayout w:type="fixed"/>
         <w:tblLook w:val="04A0" w:firstRow="1" w:lastRow="0" w:firstColumn="1" w:lastColumn="0" w:noHBand="0" w:noVBand="1"/>
       </w:tblPr>
       <w:tblGrid>
-        <w:gridCol w:w="2495"/>
-        <w:gridCol w:w="2405"/>
-        <w:gridCol w:w="3169"/>
-        <w:gridCol w:w="1281"/>
+        <w:gridCol w:w="2748"/>
+        <w:gridCol w:w="1567"/>
+        <w:gridCol w:w="3510"/>
+        <w:gridCol w:w="1525"/>
       </w:tblGrid>
       <w:tr>
         <w:tc>
           <w:tcPr>
-            <w:tcW w:w="2371" w:type="dxa"/>
+            <w:tcW w:w="2748" w:type="dxa"/>
             <w:tcBorders>
               <w:top w:val="single" w:sz="4" w:space="0" w:color="auto"/>
               <w:left w:val="single" w:sz="4" w:space="0" w:color="auto"/>
@@ -1774,7 +1871,7 @@
         </w:tc>
         <w:tc>
           <w:tcPr>
-            <w:tcW w:w="6979" w:type="dxa"/>
+            <w:tcW w:w="6602" w:type="dxa"/>
             <w:gridSpan w:val="3"/>
             <w:tcBorders>
               <w:top w:val="single" w:sz="4" w:space="0" w:color="auto"/>
@@ -1805,7 +1902,7 @@
       <w:tr>
         <w:tc>
           <w:tcPr>
-            <w:tcW w:w="2371" w:type="dxa"/>
+            <w:tcW w:w="2748" w:type="dxa"/>
             <w:tcBorders>
               <w:top w:val="single" w:sz="4" w:space="0" w:color="auto"/>
               <w:left w:val="single" w:sz="4" w:space="0" w:color="auto"/>
@@ -1818,12 +1915,16 @@
             <w:pPr>
               <w:spacing w:after="160" w:line="278" w:lineRule="auto"/>
               <w:rPr>
-                <w:sz w:val="18"/>
-                <w:szCs w:val="18"/>
-              </w:rPr>
-            </w:pPr>
-            <w:r>
-              <w:rPr>
+                <w:b/>
+                <w:bCs/>
+                <w:sz w:val="18"/>
+                <w:szCs w:val="18"/>
+              </w:rPr>
+            </w:pPr>
+            <w:r>
+              <w:rPr>
+                <w:b/>
+                <w:bCs/>
                 <w:sz w:val="18"/>
                 <w:szCs w:val="18"/>
               </w:rPr>
@@ -1833,7 +1934,7 @@
         </w:tc>
         <w:tc>
           <w:tcPr>
-            <w:tcW w:w="2694" w:type="dxa"/>
+            <w:tcW w:w="1567" w:type="dxa"/>
             <w:tcBorders>
               <w:top w:val="single" w:sz="4" w:space="0" w:color="auto"/>
               <w:left w:val="single" w:sz="4" w:space="0" w:color="auto"/>
@@ -1846,12 +1947,16 @@
             <w:pPr>
               <w:spacing w:after="160" w:line="278" w:lineRule="auto"/>
               <w:rPr>
-                <w:sz w:val="18"/>
-                <w:szCs w:val="18"/>
-              </w:rPr>
-            </w:pPr>
-            <w:r>
-              <w:rPr>
+                <w:b/>
+                <w:bCs/>
+                <w:sz w:val="18"/>
+                <w:szCs w:val="18"/>
+              </w:rPr>
+            </w:pPr>
+            <w:r>
+              <w:rPr>
+                <w:b/>
+                <w:bCs/>
                 <w:sz w:val="18"/>
                 <w:szCs w:val="18"/>
               </w:rPr>
@@ -1861,7 +1966,7 @@
         </w:tc>
         <w:tc>
           <w:tcPr>
-            <w:tcW w:w="2940" w:type="dxa"/>
+            <w:tcW w:w="3510" w:type="dxa"/>
             <w:tcBorders>
               <w:top w:val="single" w:sz="4" w:space="0" w:color="auto"/>
               <w:left w:val="single" w:sz="4" w:space="0" w:color="auto"/>
@@ -1874,12 +1979,16 @@
             <w:pPr>
               <w:spacing w:after="160" w:line="278" w:lineRule="auto"/>
               <w:rPr>
-                <w:sz w:val="18"/>
-                <w:szCs w:val="18"/>
-              </w:rPr>
-            </w:pPr>
-            <w:r>
-              <w:rPr>
+                <w:b/>
+                <w:bCs/>
+                <w:sz w:val="18"/>
+                <w:szCs w:val="18"/>
+              </w:rPr>
+            </w:pPr>
+            <w:r>
+              <w:rPr>
+                <w:b/>
+                <w:bCs/>
                 <w:sz w:val="18"/>
                 <w:szCs w:val="18"/>
               </w:rPr>
@@ -1889,7 +1998,7 @@
         </w:tc>
         <w:tc>
           <w:tcPr>
-            <w:tcW w:w="1345" w:type="dxa"/>
+            <w:tcW w:w="1525" w:type="dxa"/>
             <w:tcBorders>
               <w:top w:val="single" w:sz="4" w:space="0" w:color="auto"/>
               <w:left w:val="single" w:sz="4" w:space="0" w:color="auto"/>
@@ -1902,12 +2011,16 @@
             <w:pPr>
               <w:spacing w:after="160" w:line="278" w:lineRule="auto"/>
               <w:rPr>
-                <w:sz w:val="18"/>
-                <w:szCs w:val="18"/>
-              </w:rPr>
-            </w:pPr>
-            <w:r>
-              <w:rPr>
+                <w:b/>
+                <w:bCs/>
+                <w:sz w:val="18"/>
+                <w:szCs w:val="18"/>
+              </w:rPr>
+            </w:pPr>
+            <w:r>
+              <w:rPr>
+                <w:b/>
+                <w:bCs/>
                 <w:sz w:val="18"/>
                 <w:szCs w:val="18"/>
               </w:rPr>
@@ -1919,7 +2032,7 @@
       <w:tr>
         <w:tc>
           <w:tcPr>
-            <w:tcW w:w="2371" w:type="dxa"/>
+            <w:tcW w:w="2748" w:type="dxa"/>
             <w:tcBorders>
               <w:top w:val="single" w:sz="4" w:space="0" w:color="auto"/>
               <w:left w:val="single" w:sz="4" w:space="0" w:color="auto"/>
@@ -1932,33 +2045,34 @@
             <w:pPr>
               <w:spacing w:after="160" w:line="278" w:lineRule="auto"/>
               <w:rPr>
-                <w:sz w:val="18"/>
-                <w:szCs w:val="18"/>
-              </w:rPr>
-            </w:pPr>
-            <w:r>
-              <w:rPr>
-                <w:color w:val="FF0000"/>
-                <w:sz w:val="18"/>
-                <w:szCs w:val="18"/>
+                <w:sz w:val="20"/>
+                <w:szCs w:val="20"/>
+                <w:lang w:val="en-CA"/>
+              </w:rPr>
+            </w:pPr>
+            <w:r>
+              <w:rPr>
+                <w:sz w:val="20"/>
+                <w:szCs w:val="20"/>
+                <w:lang w:val="en-CA"/>
               </w:rPr>
               <w:t>{{#LabTestRequired</w:t>
             </w:r>
             <w:proofErr w:type="gramStart"/>
             <w:r>
               <w:rPr>
-                <w:color w:val="FF0000"/>
-                <w:sz w:val="18"/>
-                <w:szCs w:val="18"/>
+                <w:sz w:val="20"/>
+                <w:szCs w:val="20"/>
+                <w:lang w:val="en-CA"/>
               </w:rPr>
               <w:t>}}{</w:t>
             </w:r>
             <w:proofErr w:type="gramEnd"/>
             <w:r>
               <w:rPr>
-                <w:color w:val="FF0000"/>
-                <w:sz w:val="18"/>
-                <w:szCs w:val="18"/>
+                <w:sz w:val="20"/>
+                <w:szCs w:val="20"/>
+                <w:lang w:val="en-CA"/>
               </w:rPr>
               <w:t>{Name}}</w:t>
             </w:r>
@@ -1966,7 +2080,7 @@
         </w:tc>
         <w:tc>
           <w:tcPr>
-            <w:tcW w:w="2694" w:type="dxa"/>
+            <w:tcW w:w="1567" w:type="dxa"/>
             <w:tcBorders>
               <w:top w:val="single" w:sz="4" w:space="0" w:color="auto"/>
               <w:left w:val="single" w:sz="4" w:space="0" w:color="auto"/>
@@ -1979,34 +2093,34 @@
             <w:pPr>
               <w:spacing w:after="160" w:line="278" w:lineRule="auto"/>
               <w:rPr>
-                <w:color w:val="FF0000"/>
-                <w:sz w:val="18"/>
-                <w:szCs w:val="18"/>
-              </w:rPr>
-            </w:pPr>
-            <w:r>
-              <w:rPr>
-                <w:color w:val="FF0000"/>
-                <w:sz w:val="18"/>
-                <w:szCs w:val="18"/>
+                <w:sz w:val="20"/>
+                <w:szCs w:val="20"/>
+                <w:lang w:val="en-CA"/>
+              </w:rPr>
+            </w:pPr>
+            <w:r>
+              <w:rPr>
+                <w:sz w:val="20"/>
+                <w:szCs w:val="20"/>
+                <w:lang w:val="en-CA"/>
               </w:rPr>
               <w:t>{{</w:t>
             </w:r>
             <w:proofErr w:type="spellStart"/>
             <w:r>
               <w:rPr>
-                <w:color w:val="FF0000"/>
-                <w:sz w:val="18"/>
-                <w:szCs w:val="18"/>
+                <w:sz w:val="20"/>
+                <w:szCs w:val="20"/>
+                <w:lang w:val="en-CA"/>
               </w:rPr>
               <w:t>ResultValue</w:t>
             </w:r>
             <w:proofErr w:type="spellEnd"/>
             <w:r>
               <w:rPr>
-                <w:color w:val="FF0000"/>
-                <w:sz w:val="18"/>
-                <w:szCs w:val="18"/>
+                <w:sz w:val="20"/>
+                <w:szCs w:val="20"/>
+                <w:lang w:val="en-CA"/>
               </w:rPr>
               <w:t>}}</w:t>
             </w:r>
@@ -2014,7 +2128,7 @@
         </w:tc>
         <w:tc>
           <w:tcPr>
-            <w:tcW w:w="2940" w:type="dxa"/>
+            <w:tcW w:w="3510" w:type="dxa"/>
             <w:tcBorders>
               <w:top w:val="single" w:sz="4" w:space="0" w:color="auto"/>
               <w:left w:val="single" w:sz="4" w:space="0" w:color="auto"/>
@@ -2034,18 +2148,18 @@
             </w:pPr>
             <w:r>
               <w:rPr>
-                <w:color w:val="FF0000"/>
-                <w:sz w:val="18"/>
-                <w:szCs w:val="18"/>
+                <w:sz w:val="20"/>
+                <w:szCs w:val="20"/>
+                <w:lang w:val="en-CA"/>
               </w:rPr>
               <w:t>{{</w:t>
             </w:r>
             <w:proofErr w:type="spellStart"/>
             <w:r>
               <w:rPr>
-                <w:color w:val="FF0000"/>
-                <w:sz w:val="18"/>
-                <w:szCs w:val="18"/>
+                <w:sz w:val="20"/>
+                <w:szCs w:val="20"/>
+                <w:lang w:val="en-CA"/>
               </w:rPr>
               <w:t>UnitOfMeasure</w:t>
             </w:r>
@@ -2053,36 +2167,36 @@
             <w:proofErr w:type="gramStart"/>
             <w:r>
               <w:rPr>
-                <w:color w:val="FF0000"/>
-                <w:sz w:val="18"/>
-                <w:szCs w:val="18"/>
+                <w:sz w:val="20"/>
+                <w:szCs w:val="20"/>
+                <w:lang w:val="en-CA"/>
               </w:rPr>
               <w:t>}}{</w:t>
             </w:r>
             <w:proofErr w:type="gramEnd"/>
             <w:r>
               <w:rPr>
-                <w:color w:val="FF0000"/>
-                <w:sz w:val="18"/>
-                <w:szCs w:val="18"/>
+                <w:sz w:val="20"/>
+                <w:szCs w:val="20"/>
+                <w:lang w:val="en-CA"/>
               </w:rPr>
               <w:t>{/</w:t>
             </w:r>
             <w:proofErr w:type="spellStart"/>
             <w:r>
               <w:rPr>
-                <w:color w:val="FF0000"/>
-                <w:sz w:val="18"/>
-                <w:szCs w:val="18"/>
+                <w:sz w:val="20"/>
+                <w:szCs w:val="20"/>
+                <w:lang w:val="en-CA"/>
               </w:rPr>
               <w:t>LabTestRequired</w:t>
             </w:r>
             <w:proofErr w:type="spellEnd"/>
             <w:r>
               <w:rPr>
-                <w:color w:val="FF0000"/>
-                <w:sz w:val="18"/>
-                <w:szCs w:val="18"/>
+                <w:sz w:val="20"/>
+                <w:szCs w:val="20"/>
+                <w:lang w:val="en-CA"/>
               </w:rPr>
               <w:t>}}</w:t>
             </w:r>
@@ -2090,7 +2204,7 @@
         </w:tc>
         <w:tc>
           <w:tcPr>
-            <w:tcW w:w="1345" w:type="dxa"/>
+            <w:tcW w:w="1525" w:type="dxa"/>
             <w:tcBorders>
               <w:top w:val="single" w:sz="4" w:space="0" w:color="auto"/>
               <w:left w:val="single" w:sz="4" w:space="0" w:color="auto"/>
@@ -2111,7 +2225,6 @@
         </w:tc>
       </w:tr>
     </w:tbl>
-    <w:p/>
     <w:p/>
     <w:sectPr>
       <w:pgSz w:w="12240" w:h="15840"/>

</xml_diff>